<commit_message>
Kit induccion: plan por ETAPAS y dominio demostrado (no calendario) — sin dias en titulos ni tabla; la verificacion es la puerta, no el tiempo
Co-Authored-By: Claude Fable 5 <noreply@anthropic.com>
Claude-Session: https://claude.ai/code/session_018H7C5dx3NvDfXiv3CfhPMa
</commit_message>
<xml_diff>
--- a/recursos/comercial/INDUCCION_COMERCIAL/KIT_INDUCCION_ASESORA_COMERCIAL.docx
+++ b/recursos/comercial/INDUCCION_COMERCIAL/KIT_INDUCCION_ASESORA_COMERCIAL.docx
@@ -54,7 +54,19 @@
           <w:color w:val="222222"/>
           <w:sz w:val="26"/>
         </w:rPr>
-        <w:t>Meta: que en 2 semanas vendas como el sistema Heiiu, no como te enseñaron en otro lado.</w:t>
+        <w:t>Meta: que vendas como el sistema Heiiu, no como te enseñaron en otro lado.</w:t>
+      </w:r>
+    </w:p>
+    <w:p>
+      <w:pPr>
+        <w:jc w:val="center"/>
+      </w:pPr>
+      <w:r>
+        <w:rPr>
+          <w:color w:val="222222"/>
+          <w:sz w:val="26"/>
+        </w:rPr>
+        <w:t>Se avanza por dominio demostrado, no por calendario.</w:t>
       </w:r>
     </w:p>
     <w:p>
@@ -84,7 +96,7 @@
           <w:color w:val="E54C09"/>
           <w:sz w:val="36"/>
         </w:rPr>
-        <w:t>1.  QUÉ VENDE HEIIU (día 1)</w:t>
+        <w:t>1.  QUÉ VENDE HEIIU</w:t>
       </w:r>
     </w:p>
     <w:p>
@@ -207,7 +219,7 @@
           <w:color w:val="E54C09"/>
           <w:sz w:val="36"/>
         </w:rPr>
-        <w:t>2.  PRODUCTOS Y PRECIOS (día 1-2)</w:t>
+        <w:t>2.  PRODUCTOS Y PRECIOS</w:t>
       </w:r>
     </w:p>
     <w:tbl>
@@ -533,7 +545,7 @@
           <w:color w:val="E54C09"/>
           <w:sz w:val="36"/>
         </w:rPr>
-        <w:t>3.  EL FONDO DE BECAS (día 2 — el corazón del cierre)</w:t>
+        <w:t>3.  EL FONDO DE BECAS — el corazón del cierre</w:t>
       </w:r>
     </w:p>
     <w:tbl>
@@ -661,7 +673,7 @@
           <w:color w:val="E54C09"/>
           <w:sz w:val="36"/>
         </w:rPr>
-        <w:t>4.  EL FUNNEL Y TU PUESTO EN ÉL (día 3)</w:t>
+        <w:t>4.  EL FUNNEL Y TU PUESTO EN ÉL</w:t>
       </w:r>
     </w:p>
     <w:tbl>
@@ -735,7 +747,7 @@
           <w:color w:val="E54C09"/>
           <w:sz w:val="36"/>
         </w:rPr>
-        <w:t>5.  LA CITA Y LA ESCALERA DE CIERRE (día 4-5 — tu oficio)</w:t>
+        <w:t>5.  LA CITA Y LA ESCALERA DE CIERRE — tu oficio</w:t>
       </w:r>
     </w:p>
     <w:p>
@@ -809,7 +821,7 @@
           <w:color w:val="E54C09"/>
           <w:sz w:val="36"/>
         </w:rPr>
-        <w:t>6.  LO QUE NUNCA SE HACE (día 5 — lo que te puede costar el puesto)</w:t>
+        <w:t>6.  LO QUE NUNCA SE HACE — lo que te puede costar el puesto</w:t>
       </w:r>
     </w:p>
     <w:p>
@@ -899,7 +911,7 @@
           <w:color w:val="E54C09"/>
           <w:sz w:val="36"/>
         </w:rPr>
-        <w:t>7.  REPORTES Y COMISIONES (día 5)</w:t>
+        <w:t>7.  REPORTES Y COMISIONES</w:t>
       </w:r>
     </w:p>
     <w:p>
@@ -948,7 +960,7 @@
           <w:color w:val="E54C09"/>
           <w:sz w:val="36"/>
         </w:rPr>
-        <w:t>8.  CANALES ESPECIALES (semana 2)</w:t>
+        <w:t>8.  CANALES ESPECIALES</w:t>
       </w:r>
     </w:p>
     <w:p>
@@ -997,7 +1009,19 @@
           <w:color w:val="E54C09"/>
           <w:sz w:val="36"/>
         </w:rPr>
-        <w:t>9.  TU PLAN DE 2 SEMANAS (con filtro)</w:t>
+        <w:t>9.  TU PLAN DE INDUCCIÓN (se avanza por DOMINIO, no por calendario)</w:t>
+      </w:r>
+    </w:p>
+    <w:p>
+      <w:pPr>
+        <w:spacing w:after="60"/>
+      </w:pPr>
+      <w:r>
+        <w:rPr>
+          <w:b/>
+          <w:sz w:val="24"/>
+        </w:rPr>
+        <w:t>La regla: cada etapa se supera demostrando la verificación de la derecha — el mismo día si la demuestras. Quien llega con oficio puede estar en citas acompañadas en 2-3 días; nadie pasa a la siguiente etapa sin la verificación de la anterior.</w:t>
       </w:r>
     </w:p>
     <w:tbl>
@@ -1024,7 +1048,7 @@
                 <w:color w:val="FFFFFF"/>
                 <w:sz w:val="22"/>
               </w:rPr>
-              <w:t>Día</w:t>
+              <w:t>Etapa</w:t>
             </w:r>
           </w:p>
         </w:tc>
@@ -1056,7 +1080,7 @@
                 <w:color w:val="FFFFFF"/>
                 <w:sz w:val="22"/>
               </w:rPr>
-              <w:t>Verificación</w:t>
+              <w:t>Se supera cuando…</w:t>
             </w:r>
           </w:p>
         </w:tc>
@@ -1194,7 +1218,7 @@
               <w:rPr>
                 <w:sz w:val="22"/>
               </w:rPr>
-              <w:t>4-5</w:t>
+              <w:t>4</w:t>
             </w:r>
           </w:p>
         </w:tc>
@@ -1235,7 +1259,7 @@
               <w:rPr>
                 <w:sz w:val="22"/>
               </w:rPr>
-              <w:t>6-8</w:t>
+              <w:t>5</w:t>
             </w:r>
           </w:p>
         </w:tc>
@@ -1276,7 +1300,7 @@
               <w:rPr>
                 <w:sz w:val="22"/>
               </w:rPr>
-              <w:t>9-10</w:t>
+              <w:t>6</w:t>
             </w:r>
           </w:p>
         </w:tc>
@@ -1317,7 +1341,7 @@
               <w:rPr>
                 <w:sz w:val="22"/>
               </w:rPr>
-              <w:t>15</w:t>
+              <w:t>7</w:t>
             </w:r>
           </w:p>
         </w:tc>
@@ -1343,7 +1367,7 @@
               <w:rPr>
                 <w:sz w:val="22"/>
               </w:rPr>
-              <w:t>8/10 mínimo — si no, semana adicional antes de soltar</w:t>
+              <w:t>8/10 mínimo — si no, refuerzo y se repite antes de soltar</w:t>
             </w:r>
           </w:p>
         </w:tc>

</xml_diff>

<commit_message>
Kit induccion final: sin lineas Leer (rutas internas que la asesora no puede abrir); reglamento del Fondo como entrega impresa de gerencia
Co-Authored-By: Claude Fable 5 <noreply@anthropic.com>
Claude-Session: https://claude.ai/code/session_018H7C5dx3NvDfXiv3CfhPMa
</commit_message>
<xml_diff>
--- a/recursos/comercial/INDUCCION_COMERCIAL/KIT_INDUCCION_ASESORA_COMERCIAL.docx
+++ b/recursos/comercial/INDUCCION_COMERCIAL/KIT_INDUCCION_ASESORA_COMERCIAL.docx
@@ -195,18 +195,6 @@
           <w:sz w:val="24"/>
         </w:rPr>
         <w:t>Regla de balance: se lidera con PERTENENCIA, se refuerza con RESPALDO. Si la beca se vuelve protagonista, atraes gente que viene por la plata y no por el compromiso.</w:t>
-      </w:r>
-    </w:p>
-    <w:p>
-      <w:pPr>
-        <w:spacing w:after="120"/>
-      </w:pPr>
-      <w:r>
-        <w:rPr>
-          <w:color w:val="777777"/>
-          <w:sz w:val="21"/>
-        </w:rPr>
-        <w:t>Leer: Guia_Agente_Comercial_IA_Heiiu_v15 (§1-§2 + las 6 creencias). El bot precalifica y agenda; TÚ cierras.</w:t>
       </w:r>
     </w:p>
     <w:p>
@@ -648,14 +636,14 @@
     </w:p>
     <w:p>
       <w:pPr>
-        <w:spacing w:after="120"/>
+        <w:spacing w:after="60"/>
       </w:pPr>
       <w:r>
         <w:rPr>
-          <w:color w:val="777777"/>
-          <w:sz w:val="21"/>
+          <w:b w:val="0"/>
+          <w:sz w:val="24"/>
         </w:rPr>
-        <w:t>Leer: FONDO_BECAS_REGLAMENTO (completo — 2 páginas).</w:t>
+        <w:t>El reglamento del Fondo (2 páginas) te lo entrega gerencia impreso — es el mismo que recibe el estudiante becado con su carta.</w:t>
       </w:r>
     </w:p>
     <w:p>

</xml_diff>

<commit_message>
Escalera de cierre en tabla: 5 escalones con precios (Arranque integrado como escalon 2), regla del no-trabajado, descuento 20pct solo escalon 3 en cita, escalon 5 = siembra con motivo real, y las 2 trampas
Co-Authored-By: Claude Fable 5 <noreply@anthropic.com>
Claude-Session: https://claude.ai/code/session_018H7C5dx3NvDfXiv3CfhPMa
</commit_message>
<xml_diff>
--- a/recursos/comercial/INDUCCION_COMERCIAL/KIT_INDUCCION_ASESORA_COMERCIAL.docx
+++ b/recursos/comercial/INDUCCION_COMERCIAL/KIT_INDUCCION_ASESORA_COMERCIAL.docx
@@ -760,7 +760,296 @@
           <w:color w:val="222222"/>
           <w:sz w:val="26"/>
         </w:rPr>
-        <w:t>La escalera de cierre (en orden, nunca saltar)</w:t>
+        <w:t>La escalera de cierre — la regla: nadie sale sin que se le ofrezca el escalón siguiente</w:t>
+      </w:r>
+    </w:p>
+    <w:p>
+      <w:pPr>
+        <w:spacing w:after="60"/>
+      </w:pPr>
+      <w:r>
+        <w:rPr>
+          <w:b/>
+          <w:sz w:val="24"/>
+        </w:rPr>
+        <w:t>SIEMPRE se empieza ARRIBA. Solo se baja un escalón cuando hay un NO real YA TRABAJADO (objeción respondida y aun así no). Bajar sin ese no = regalar plata. Saltar escalones = perder ventas.</w:t>
+      </w:r>
+    </w:p>
+    <w:tbl>
+      <w:tblPr>
+        <w:tblStyle w:val="TableGrid"/>
+        <w:tblW w:type="auto" w:w="0"/>
+        <w:tblLook w:firstColumn="1" w:firstRow="1" w:lastColumn="0" w:lastRow="0" w:noHBand="0" w:noVBand="1" w:val="04A0"/>
+      </w:tblPr>
+      <w:tblGrid>
+        <w:gridCol w:w="3324"/>
+        <w:gridCol w:w="3324"/>
+        <w:gridCol w:w="3324"/>
+      </w:tblGrid>
+      <w:tr>
+        <w:tc>
+          <w:tcPr>
+            <w:tcW w:type="dxa" w:w="3324"/>
+            <w:shd w:val="clear" w:fill="E54C09"/>
+          </w:tcPr>
+          <w:p>
+            <w:r>
+              <w:rPr>
+                <w:b/>
+                <w:color w:val="FFFFFF"/>
+                <w:sz w:val="21"/>
+              </w:rPr>
+              <w:t>Escalón</w:t>
+            </w:r>
+          </w:p>
+        </w:tc>
+        <w:tc>
+          <w:tcPr>
+            <w:tcW w:type="dxa" w:w="3324"/>
+            <w:shd w:val="clear" w:fill="E54C09"/>
+          </w:tcPr>
+          <w:p>
+            <w:r>
+              <w:rPr>
+                <w:b/>
+                <w:color w:val="FFFFFF"/>
+                <w:sz w:val="21"/>
+              </w:rPr>
+              <w:t>Qué se ofrece</w:t>
+            </w:r>
+          </w:p>
+        </w:tc>
+        <w:tc>
+          <w:tcPr>
+            <w:tcW w:type="dxa" w:w="3324"/>
+            <w:shd w:val="clear" w:fill="E54C09"/>
+          </w:tcPr>
+          <w:p>
+            <w:r>
+              <w:rPr>
+                <w:b/>
+                <w:color w:val="FFFFFF"/>
+                <w:sz w:val="21"/>
+              </w:rPr>
+              <w:t>Se baja cuando…</w:t>
+            </w:r>
+          </w:p>
+        </w:tc>
+      </w:tr>
+      <w:tr>
+        <w:tc>
+          <w:tcPr>
+            <w:tcW w:type="dxa" w:w="3324"/>
+          </w:tcPr>
+          <w:p>
+            <w:r>
+              <w:rPr>
+                <w:sz w:val="21"/>
+              </w:rPr>
+              <w:t>1</w:t>
+            </w:r>
+          </w:p>
+        </w:tc>
+        <w:tc>
+          <w:tcPr>
+            <w:tcW w:type="dxa" w:w="3324"/>
+          </w:tcPr>
+          <w:p>
+            <w:r>
+              <w:rPr>
+                <w:sz w:val="21"/>
+              </w:rPr>
+              <w:t>PROGRAMA COMPLETO con su beca del Fondo (el número exacto sale de la tabla en pesos)</w:t>
+            </w:r>
+          </w:p>
+        </w:tc>
+        <w:tc>
+          <w:tcPr>
+            <w:tcW w:type="dxa" w:w="3324"/>
+          </w:tcPr>
+          <w:p>
+            <w:r>
+              <w:rPr>
+                <w:sz w:val="21"/>
+              </w:rPr>
+              <w:t>No real, ya respondido con plan de pagos y Fondo</w:t>
+            </w:r>
+          </w:p>
+        </w:tc>
+      </w:tr>
+      <w:tr>
+        <w:tc>
+          <w:tcPr>
+            <w:tcW w:type="dxa" w:w="3324"/>
+          </w:tcPr>
+          <w:p>
+            <w:r>
+              <w:rPr>
+                <w:sz w:val="21"/>
+              </w:rPr>
+              <w:t>2</w:t>
+            </w:r>
+          </w:p>
+        </w:tc>
+        <w:tc>
+          <w:tcPr>
+            <w:tcW w:type="dxa" w:w="3324"/>
+          </w:tcPr>
+          <w:p>
+            <w:r>
+              <w:rPr>
+                <w:sz w:val="21"/>
+              </w:rPr>
+              <w:t>ARRANQUE A1+A2 — $2.990.000 (si empieza de cero) o el paquete menor hacia B2 (si ya tiene nivel)</w:t>
+            </w:r>
+          </w:p>
+        </w:tc>
+        <w:tc>
+          <w:tcPr>
+            <w:tcW w:type="dxa" w:w="3324"/>
+          </w:tcPr>
+          <w:p>
+            <w:r>
+              <w:rPr>
+                <w:sz w:val="21"/>
+              </w:rPr>
+              <w:t>No real trabajado</w:t>
+            </w:r>
+          </w:p>
+        </w:tc>
+      </w:tr>
+      <w:tr>
+        <w:tc>
+          <w:tcPr>
+            <w:tcW w:type="dxa" w:w="3324"/>
+          </w:tcPr>
+          <w:p>
+            <w:r>
+              <w:rPr>
+                <w:sz w:val="21"/>
+              </w:rPr>
+              <w:t>3</w:t>
+            </w:r>
+          </w:p>
+        </w:tc>
+        <w:tc>
+          <w:tcPr>
+            <w:tcW w:type="dxa" w:w="3324"/>
+          </w:tcPr>
+          <w:p>
+            <w:r>
+              <w:rPr>
+                <w:sz w:val="21"/>
+              </w:rPr>
+              <w:t>NIVEL SUELTO (ej. solo A1: $1.596.000). Aquí — y SOLO aquí — está tu única carta: hasta 20% de descuento por pago de contado, SOLO en cita presencial, JAMÁS por teléfono o WhatsApp</w:t>
+            </w:r>
+          </w:p>
+        </w:tc>
+        <w:tc>
+          <w:tcPr>
+            <w:tcW w:type="dxa" w:w="3324"/>
+          </w:tcPr>
+          <w:p>
+            <w:r>
+              <w:rPr>
+                <w:sz w:val="21"/>
+              </w:rPr>
+              <w:t>No real trabajado</w:t>
+            </w:r>
+          </w:p>
+        </w:tc>
+      </w:tr>
+      <w:tr>
+        <w:tc>
+          <w:tcPr>
+            <w:tcW w:type="dxa" w:w="3324"/>
+          </w:tcPr>
+          <w:p>
+            <w:r>
+              <w:rPr>
+                <w:sz w:val="21"/>
+              </w:rPr>
+              <w:t>4</w:t>
+            </w:r>
+          </w:p>
+        </w:tc>
+        <w:tc>
+          <w:tcPr>
+            <w:tcW w:type="dxa" w:w="3324"/>
+          </w:tcPr>
+          <w:p>
+            <w:r>
+              <w:rPr>
+                <w:sz w:val="21"/>
+              </w:rPr>
+              <w:t>SABATINO — la entrada más económica (4h/semana, por nivel, sin beca)</w:t>
+            </w:r>
+          </w:p>
+        </w:tc>
+        <w:tc>
+          <w:tcPr>
+            <w:tcW w:type="dxa" w:w="3324"/>
+          </w:tcPr>
+          <w:p>
+            <w:r>
+              <w:rPr>
+                <w:sz w:val="21"/>
+              </w:rPr>
+              <w:t>No real trabajado</w:t>
+            </w:r>
+          </w:p>
+        </w:tc>
+      </w:tr>
+      <w:tr>
+        <w:tc>
+          <w:tcPr>
+            <w:tcW w:type="dxa" w:w="3324"/>
+          </w:tcPr>
+          <w:p>
+            <w:r>
+              <w:rPr>
+                <w:sz w:val="21"/>
+              </w:rPr>
+              <w:t>5</w:t>
+            </w:r>
+          </w:p>
+        </w:tc>
+        <w:tc>
+          <w:tcPr>
+            <w:tcW w:type="dxa" w:w="3324"/>
+          </w:tcPr>
+          <w:p>
+            <w:r>
+              <w:rPr>
+                <w:sz w:val="21"/>
+              </w:rPr>
+              <w:t>NO es una venta, es una SIEMBRA: se anota el MOTIVO REAL del no + teléfono, a la base de rescate</w:t>
+            </w:r>
+          </w:p>
+        </w:tc>
+        <w:tc>
+          <w:tcPr>
+            <w:tcW w:type="dxa" w:w="3324"/>
+          </w:tcPr>
+          <w:p>
+            <w:r>
+              <w:rPr>
+                <w:sz w:val="21"/>
+              </w:rPr>
+              <w:t>—</w:t>
+            </w:r>
+          </w:p>
+        </w:tc>
+      </w:tr>
+    </w:tbl>
+    <w:p>
+      <w:pPr>
+        <w:spacing w:after="0"/>
+      </w:pPr>
+      <w:r>
+        <w:rPr>
+          <w:sz w:val="8"/>
+        </w:rPr>
       </w:r>
     </w:p>
     <w:p>
@@ -772,7 +1061,19 @@
           <w:b w:val="0"/>
           <w:sz w:val="24"/>
         </w:rPr>
-        <w:t>1) Paquete completo con beca máxima → 2) paquete menor hacia B2 → 3) nivel suelto (el descuento de cierre es TU carta: solo en cita, nunca por teléfono) → 4) sabatino → 5) si nada: base de rescate con el motivo REAL anotado. El "no" de hoy con motivo anotado es la venta del mes siguiente.</w:t>
+        <w:t>El escalón 5 es el que paga el mes siguiente: cuando hagas la tanda de rescate no llamas a ciegas — llamas con el motivo en la mano ("me contaste que en diciembre te pagan la prima…"). El "no" de hoy con motivo anotado es la venta del mes siguiente.</w:t>
+      </w:r>
+    </w:p>
+    <w:p>
+      <w:pPr>
+        <w:spacing w:after="60"/>
+      </w:pPr>
+      <w:r>
+        <w:rPr>
+          <w:b/>
+          <w:sz w:val="24"/>
+        </w:rPr>
+        <w:t>Las dos trampas que te vigilas: (1) jamás ARRANCAR abajo — quien abre ofreciendo sabatino nunca vende un completo; (2) jamás bajar rápido — le enseñas al cliente que esperando consigue menos precio.</w:t>
       </w:r>
     </w:p>
     <w:p>

</xml_diff>

<commit_message>
Reporte diario formato Brian: contactos POR NOMBRE ("Hoy contacte a: A,B,C,D = 4", seguimientos cuentan y se repiten) — en acuerdo de actividad minima y modulo 7 del kit de induccion
Co-Authored-By: Claude Fable 5 <noreply@anthropic.com>
Claude-Session: https://claude.ai/code/session_018H7C5dx3NvDfXiv3CfhPMa
</commit_message>
<xml_diff>
--- a/recursos/comercial/INDUCCION_COMERCIAL/KIT_INDUCCION_ASESORA_COMERCIAL.docx
+++ b/recursos/comercial/INDUCCION_COMERCIAL/KIT_INDUCCION_ASESORA_COMERCIAL.docx
@@ -1212,6 +1212,18 @@
           <w:b/>
           <w:sz w:val="24"/>
         </w:rPr>
+        <w:t>REPORTE DIARIO (6:00 PM por WhatsApp, formato exacto): "Hoy contacté a: [nombres] = N · Citas agendadas: N · Citas asistidas: N · Cierres/abonos: N · Caja: $". Los contactos van POR NOMBRE — nuevos y seguimientos cuentan, y la misma persona puede repetirse en días distintos. Día sin reporte = día sin actividad verificable.</w:t>
+      </w:r>
+    </w:p>
+    <w:p>
+      <w:pPr>
+        <w:spacing w:after="60"/>
+      </w:pPr>
+      <w:r>
+        <w:rPr>
+          <w:b/>
+          <w:sz w:val="24"/>
+        </w:rPr>
         <w:t>REPORTE SEMANAL (cada lunes antes del mediodía): citas agendadas y asistidas · matrículas con nombres y valores · caja que ENTRÓ · motivo #1 de no-cierre · lista de "lo voy a pensar" con teléfonos. Lo que no llegue queda SIN DATO en el tablero de gerencia — y sin dato se nota.</w:t>
       </w:r>
     </w:p>

</xml_diff>

<commit_message>
Seccion 9 reencuadrada para expertas: "plan para quien llega nueva" — la evaluacion mide el sistema Heiiu, no la experiencia
Co-Authored-By: Claude Fable 5 <noreply@anthropic.com>
Claude-Session: https://claude.ai/code/session_018H7C5dx3NvDfXiv3CfhPMa
</commit_message>
<xml_diff>
--- a/recursos/comercial/INDUCCION_COMERCIAL/KIT_INDUCCION_ASESORA_COMERCIAL.docx
+++ b/recursos/comercial/INDUCCION_COMERCIAL/KIT_INDUCCION_ASESORA_COMERCIAL.docx
@@ -1310,7 +1310,7 @@
           <w:color w:val="E54C09"/>
           <w:sz w:val="36"/>
         </w:rPr>
-        <w:t>9.  TU PLAN DE INDUCCIÓN (se avanza por DOMINIO, no por calendario)</w:t>
+        <w:t>9.  EL PLAN PARA QUIEN LLEGA NUEVA (referencia institucional)</w:t>
       </w:r>
     </w:p>
     <w:p>
@@ -1322,7 +1322,7 @@
           <w:b/>
           <w:sz w:val="24"/>
         </w:rPr>
-        <w:t>La regla: cada etapa se supera demostrando la verificación de la derecha — el mismo día si la demuestras. Quien llega con oficio puede estar en citas acompañadas en 2-3 días; nadie pasa a la siguiente etapa sin la verificación de la anterior.</w:t>
+        <w:t>Si ya vienes con oficio comercial, la mayoría de estas etapas las recorres en días — o ya las tienes superadas. Lo único que aplica a TODAS, experta o no, es la evaluación de dominio de abajo: no mide tu experiencia vendiendo (esa ya la trajiste), mide el SISTEMA HEIIU — el Fondo, la escalera, las líneas rojas — que nadie trae de fábrica. Cada etapa se supera demostrando la verificación de la derecha, el mismo día si la demuestras.</w:t>
       </w:r>
     </w:p>
     <w:tbl>

</xml_diff>

<commit_message>
H2B fuera de la oferta: retirado del kit de venta, anexo Pasaporte, kit de induccion y mensajes de sprint (PDF regenerados); nota en la guia del agente
Co-Authored-By: Claude Fable 5.1 <noreply@anthropic.com>
</commit_message>
<xml_diff>
--- a/recursos/comercial/INDUCCION_COMERCIAL/KIT_INDUCCION_ASESORA_COMERCIAL.docx
+++ b/recursos/comercial/INDUCCION_COMERCIAL/KIT_INDUCCION_ASESORA_COMERCIAL.docx
@@ -132,7 +132,7 @@
           <w:b w:val="0"/>
           <w:sz w:val="24"/>
         </w:rPr>
-        <w:t>2. RESPALDO: alguien apuesta por ti (la beca del Fondo) y te abre puertas VERIFICADAS (Au Pair, Work &amp; Travel, H2B) — en un mercado lleno de agencias que abusan, Heiiu solo abre puertas seguras.</w:t>
+        <w:t>2. RESPALDO: alguien apuesta por ti (la beca del Fondo) y te abre puertas VERIFICADAS (Au Pair, Work &amp; Travel) — en un mercado lleno de agencias que abusan, Heiiu solo abre puertas seguras.</w:t>
       </w:r>
     </w:p>
     <w:p>
@@ -1273,7 +1273,7 @@
           <w:b w:val="0"/>
           <w:sz w:val="24"/>
         </w:rPr>
-        <w:t>· ALIANZAS INTERNACIONALES (Au Pair, Work &amp; Travel, H2B): canal probado (16 matrículas en 2024 solo por Au Pair). Posicionamiento: Heiiu es el FILTRO SEGURO — "trabajamos solo con operadores verificados". El inglés es el requisito del camino — y el Módulo Pasaporte es el producto para esta gente.</w:t>
+        <w:t>· ALIANZAS INTERNACIONALES (Au Pair, Work &amp; Travel): canal probado (16 matrículas en 2024 solo por Au Pair). Posicionamiento: Heiiu es el FILTRO SEGURO — "trabajamos solo con operadores verificados". El inglés es el requisito del camino — y el Módulo Pasaporte es el producto para esta gente.</w:t>
       </w:r>
     </w:p>
     <w:p>

</xml_diff>